<commit_message>
14vo commit, se agregó la tarea 3 de la unidad 2, 8 reinas con recocido simulado
</commit_message>
<xml_diff>
--- a/Unidad 1/Tarea 3/Fuentes de investigacion.docx
+++ b/Unidad 1/Tarea 3/Fuentes de investigacion.docx
@@ -2,27 +2,21 @@
 <file path=word/document.xml><?xml version="1.0" encoding="utf-8"?>
 <w:document xmlns:wpc="http://schemas.microsoft.com/office/word/2010/wordprocessingCanvas" xmlns:cx="http://schemas.microsoft.com/office/drawing/2014/chartex" xmlns:cx1="http://schemas.microsoft.com/office/drawing/2015/9/8/chartex" xmlns:cx2="http://schemas.microsoft.com/office/drawing/2015/10/21/chartex" xmlns:cx3="http://schemas.microsoft.com/office/drawing/2016/5/9/chartex" xmlns:cx4="http://schemas.microsoft.com/office/drawing/2016/5/10/chartex" xmlns:cx5="http://schemas.microsoft.com/office/drawing/2016/5/11/chartex" xmlns:cx6="http://schemas.microsoft.com/office/drawing/2016/5/12/chartex" xmlns:cx7="http://schemas.microsoft.com/office/drawing/2016/5/13/chartex" xmlns:cx8="http://schemas.microsoft.com/office/drawing/2016/5/14/chartex" xmlns:mc="http://schemas.openxmlformats.org/markup-compatibility/2006" xmlns:aink="http://schemas.microsoft.com/office/drawing/2016/ink" xmlns:am3d="http://schemas.microsoft.com/office/drawing/2017/model3d" xmlns:o="urn:schemas-microsoft-com:office:office" xmlns:r="http://schemas.openxmlformats.org/officeDocument/2006/relationships" xmlns:m="http://schemas.openxmlformats.org/officeDocument/2006/math" xmlns:v="urn:schemas-microsoft-com:vml" xmlns:wp14="http://schemas.microsoft.com/office/word/2010/wordprocessingDrawing" xmlns:wp="http://schemas.openxmlformats.org/drawingml/2006/wordprocessingDrawing" xmlns:w10="urn:schemas-microsoft-com:office:word" xmlns:w="http://schemas.openxmlformats.org/wordprocessingml/2006/main" xmlns:w14="http://schemas.microsoft.com/office/word/2010/wordml" xmlns:w15="http://schemas.microsoft.com/office/word/2012/wordml" xmlns:w16cex="http://schemas.microsoft.com/office/word/2018/wordml/cex" xmlns:w16cid="http://schemas.microsoft.com/office/word/2016/wordml/cid" xmlns:w16="http://schemas.microsoft.com/office/word/2018/wordml" xmlns:w16sdtdh="http://schemas.microsoft.com/office/word/2020/wordml/sdtdatahash" xmlns:w16se="http://schemas.microsoft.com/office/word/2015/wordml/symex" xmlns:wpg="http://schemas.microsoft.com/office/word/2010/wordprocessingGroup" xmlns:wpi="http://schemas.microsoft.com/office/word/2010/wordprocessingInk" xmlns:wne="http://schemas.microsoft.com/office/word/2006/wordml" xmlns:wps="http://schemas.microsoft.com/office/word/2010/wordprocessingShape" mc:Ignorable="w14 w15 w16se w16cid w16 w16cex w16sdtdh wp14">
   <w:body>
-    <w:p>
-      <w:pPr>
-        <w:pStyle w:val="Heading1"/>
-      </w:pPr>
-    </w:p>
     <w:sdt>
       <w:sdtPr>
+        <w:rPr>
+          <w:rFonts w:asciiTheme="minorHAnsi" w:eastAsiaTheme="minorHAnsi" w:hAnsiTheme="minorHAnsi" w:cstheme="minorBidi"/>
+          <w:color w:val="auto"/>
+          <w:sz w:val="22"/>
+          <w:szCs w:val="22"/>
+        </w:rPr>
         <w:id w:val="241683121"/>
         <w:docPartObj>
           <w:docPartGallery w:val="Bibliographies"/>
           <w:docPartUnique/>
         </w:docPartObj>
       </w:sdtPr>
-      <w:sdtEndPr>
-        <w:rPr>
-          <w:rFonts w:asciiTheme="minorHAnsi" w:eastAsiaTheme="minorHAnsi" w:hAnsiTheme="minorHAnsi" w:cstheme="minorBidi"/>
-          <w:color w:val="auto"/>
-          <w:sz w:val="22"/>
-          <w:szCs w:val="22"/>
-        </w:rPr>
-      </w:sdtEndPr>
+      <w:sdtEndPr/>
       <w:sdtContent>
         <w:p>
           <w:pPr>
@@ -45,6 +39,7 @@
             <w:id w:val="-573587230"/>
             <w:bibliography/>
           </w:sdtPr>
+          <w:sdtEndPr/>
           <w:sdtContent>
             <w:p>
               <w:pPr>
@@ -74,7 +69,7 @@
                   <w:noProof/>
                   <w:lang w:val="es-MX"/>
                 </w:rPr>
-                <w:t xml:space="preserve">CdCIENCIA. (14 de JULIO de 2016). </w:t>
+                <w:t xml:space="preserve">Agencia de Noticias para la divulgación de la Ciencia y Tecnología. (18 de MAYO de 2015). </w:t>
               </w:r>
               <w:r>
                 <w:rPr>
@@ -83,14 +78,14 @@
                   <w:noProof/>
                   <w:lang w:val="es-MX"/>
                 </w:rPr>
-                <w:t>YOUTUBE.COM</w:t>
-              </w:r>
-              <w:r>
-                <w:rPr>
-                  <w:noProof/>
-                  <w:lang w:val="es-MX"/>
-                </w:rPr>
-                <w:t>. Obtenido de ¿Nos quedaremos algún día sin agua?: https://www.youtube.com/watch?v=Zk2UFnBMnx8</w:t>
+                <w:t>En México se pierde el 40 por ciento del agua potable por fugas en redes</w:t>
+              </w:r>
+              <w:r>
+                <w:rPr>
+                  <w:noProof/>
+                  <w:lang w:val="es-MX"/>
+                </w:rPr>
+                <w:t>. Obtenido de https://www.dicyt.com/: https://www.dicyt.com/noticias/en-mexico-se-pierde-el-40-por-ciento-del-agua-potable-por-fugas-en-redes#:~:text=En%20M%C3%A9xico%20se%20pierde%20el,potable%20por%20fugas%20en%20redes</w:t>
               </w:r>
             </w:p>
             <w:p>
@@ -107,7 +102,7 @@
                   <w:noProof/>
                   <w:lang w:val="es-MX"/>
                 </w:rPr>
-                <w:t xml:space="preserve">fisotecsolutions. (23 de JUNIO de 2024). </w:t>
+                <w:t xml:space="preserve">Aquae Fundacion. (2020 de ENERO de 2025). </w:t>
               </w:r>
               <w:r>
                 <w:rPr>
@@ -116,14 +111,14 @@
                   <w:noProof/>
                   <w:lang w:val="es-MX"/>
                 </w:rPr>
-                <w:t>Aplicaciones de la Visión Artificial en Saneamiento y Agua Potable</w:t>
-              </w:r>
-              <w:r>
-                <w:rPr>
-                  <w:noProof/>
-                  <w:lang w:val="es-MX"/>
-                </w:rPr>
-                <w:t>. Obtenido de fisotecsolutions.com: https://fisotecsolutions.com/blog/aplicaciones-de-la-vision-artificial-en-saneamiento-y-agua-potable/</w:t>
+                <w:t>fundacionaquae.org</w:t>
+              </w:r>
+              <w:r>
+                <w:rPr>
+                  <w:noProof/>
+                  <w:lang w:val="es-MX"/>
+                </w:rPr>
+                <w:t>. Obtenido de ¿Qué industrias consumen más agua?: https://www.fundacionaquae.org/que-industrias-consumen-mas-agua/</w:t>
               </w:r>
             </w:p>
             <w:p>
@@ -132,27 +127,38 @@
                 <w:ind w:left="720" w:hanging="720"/>
                 <w:rPr>
                   <w:noProof/>
+                  <w:lang w:val="es-MX"/>
                 </w:rPr>
               </w:pPr>
               <w:r>
                 <w:rPr>
                   <w:noProof/>
-                </w:rPr>
-                <w:t xml:space="preserve">Naciones Unidas. (2025, Marzo 2). </w:t>
+                  <w:lang w:val="es-MX"/>
+                </w:rPr>
+                <w:t xml:space="preserve">Carolina Rodríguez, B. G. (2022, NOVIEMBRE 7). </w:t>
               </w:r>
               <w:r>
                 <w:rPr>
                   <w:i/>
                   <w:iCs/>
                   <w:noProof/>
-                </w:rPr>
-                <w:t>UN.org</w:t>
-              </w:r>
-              <w:r>
-                <w:rPr>
-                  <w:noProof/>
-                </w:rPr>
-                <w:t>. Retrieved from What Is Climate Change?: https://www.un.org/en/climatechange/what-is-climate-change</w:t>
+                  <w:lang w:val="en-GB"/>
+                </w:rPr>
+                <w:t>Water Context in Latin America and the Caribbean: Distribution, Regulations and Prospects for Water Reuse and Reclamation</w:t>
+              </w:r>
+              <w:r>
+                <w:rPr>
+                  <w:noProof/>
+                  <w:lang w:val="en-GB"/>
+                </w:rPr>
+                <w:t xml:space="preserve">. </w:t>
+              </w:r>
+              <w:r>
+                <w:rPr>
+                  <w:noProof/>
+                  <w:lang w:val="es-MX"/>
+                </w:rPr>
+                <w:t>Retrieved from mdpi.com: https://www.mdpi.com/2073-4441/14/21/3589</w:t>
               </w:r>
             </w:p>
             <w:p>
@@ -169,7 +175,7 @@
                   <w:noProof/>
                   <w:lang w:val="es-MX"/>
                 </w:rPr>
-                <w:t xml:space="preserve">silvertubos. (15 de AGOSTO de 2024). </w:t>
+                <w:t xml:space="preserve">CdCIENCIA. (14 de JULIO de 2016). </w:t>
               </w:r>
               <w:r>
                 <w:rPr>
@@ -178,6 +184,200 @@
                   <w:noProof/>
                   <w:lang w:val="es-MX"/>
                 </w:rPr>
+                <w:t>YOUTUBE.COM</w:t>
+              </w:r>
+              <w:r>
+                <w:rPr>
+                  <w:noProof/>
+                  <w:lang w:val="es-MX"/>
+                </w:rPr>
+                <w:t>. Obtenido de ¿Nos quedaremos algún día sin agua?: https://www.youtube.com/watch?v=Zk2UFnBMnx8</w:t>
+              </w:r>
+            </w:p>
+            <w:p>
+              <w:pPr>
+                <w:pStyle w:val="Bibliography"/>
+                <w:ind w:left="720" w:hanging="720"/>
+                <w:rPr>
+                  <w:noProof/>
+                  <w:lang w:val="es-MX"/>
+                </w:rPr>
+              </w:pPr>
+              <w:r>
+                <w:rPr>
+                  <w:noProof/>
+                  <w:lang w:val="es-MX"/>
+                </w:rPr>
+                <w:t xml:space="preserve">fisotecsolutions. (23 de JUNIO de 2024). </w:t>
+              </w:r>
+              <w:r>
+                <w:rPr>
+                  <w:i/>
+                  <w:iCs/>
+                  <w:noProof/>
+                  <w:lang w:val="es-MX"/>
+                </w:rPr>
+                <w:t>Aplicaciones de la Visión Artificial en Saneamiento y Agua Potable</w:t>
+              </w:r>
+              <w:r>
+                <w:rPr>
+                  <w:noProof/>
+                  <w:lang w:val="es-MX"/>
+                </w:rPr>
+                <w:t>. Obtenido de fisotecsolutions.com: https://fisotecsolutions.com/blog/aplicaciones-de-la-vision-artificial-en-saneamiento-y-agua-potable/</w:t>
+              </w:r>
+            </w:p>
+            <w:p>
+              <w:pPr>
+                <w:pStyle w:val="Bibliography"/>
+                <w:ind w:left="720" w:hanging="720"/>
+                <w:rPr>
+                  <w:noProof/>
+                  <w:lang w:val="es-MX"/>
+                </w:rPr>
+              </w:pPr>
+              <w:r>
+                <w:rPr>
+                  <w:noProof/>
+                  <w:lang w:val="es-MX"/>
+                </w:rPr>
+                <w:t xml:space="preserve">grupohidraulica. (4 de DICIEMBRE de 2023). </w:t>
+              </w:r>
+              <w:r>
+                <w:rPr>
+                  <w:i/>
+                  <w:iCs/>
+                  <w:noProof/>
+                  <w:lang w:val="es-MX"/>
+                </w:rPr>
+                <w:t>¿Cuáles son las causas de una fuga de agua y cómo solucionarla?</w:t>
+              </w:r>
+              <w:r>
+                <w:rPr>
+                  <w:noProof/>
+                  <w:lang w:val="es-MX"/>
+                </w:rPr>
+                <w:t xml:space="preserve"> Obtenido de grupohidraulica.com: https://grupohidraulica.com/noticias/2022/10/23/fuga-de-agua-soluciones/</w:t>
+              </w:r>
+            </w:p>
+            <w:p>
+              <w:pPr>
+                <w:pStyle w:val="Bibliography"/>
+                <w:ind w:left="720" w:hanging="720"/>
+                <w:rPr>
+                  <w:noProof/>
+                </w:rPr>
+              </w:pPr>
+              <w:r>
+                <w:rPr>
+                  <w:noProof/>
+                </w:rPr>
+                <w:t xml:space="preserve">Naciones Unidas. (2025, Marzo 2). </w:t>
+              </w:r>
+              <w:r>
+                <w:rPr>
+                  <w:i/>
+                  <w:iCs/>
+                  <w:noProof/>
+                </w:rPr>
+                <w:t>UN.org</w:t>
+              </w:r>
+              <w:r>
+                <w:rPr>
+                  <w:noProof/>
+                </w:rPr>
+                <w:t>. Retrieved from What Is Climate Change?: https://www.un.org/en/climatechange/what-is-climate-change</w:t>
+              </w:r>
+            </w:p>
+            <w:p>
+              <w:pPr>
+                <w:pStyle w:val="Bibliography"/>
+                <w:ind w:left="720" w:hanging="720"/>
+                <w:rPr>
+                  <w:noProof/>
+                  <w:lang w:val="es-MX"/>
+                </w:rPr>
+              </w:pPr>
+              <w:r>
+                <w:rPr>
+                  <w:noProof/>
+                  <w:lang w:val="es-MX"/>
+                </w:rPr>
+                <w:t xml:space="preserve">ÓRGANO INFORMATIVO DE LA UNIVERSIDAD NACIONAL AUTÓNOMA DE MÉXICO. (3 de MARZO de 2025). </w:t>
+              </w:r>
+              <w:r>
+                <w:rPr>
+                  <w:i/>
+                  <w:iCs/>
+                  <w:noProof/>
+                  <w:lang w:val="es-MX"/>
+                </w:rPr>
+                <w:t>Más de 80% del agua se va en uso agrícola y de la industria</w:t>
+              </w:r>
+              <w:r>
+                <w:rPr>
+                  <w:noProof/>
+                  <w:lang w:val="es-MX"/>
+                </w:rPr>
+                <w:t>. Obtenido de www.gaceta.unam.mx: https://www.gaceta.unam.mx/crisis-agua-industria/#:~:text=La%20industria%20contamina%20m%C3%A1s,%2C%20industrial%2C%20agr%C3%ADcola%20o%20minero.</w:t>
+              </w:r>
+            </w:p>
+            <w:p>
+              <w:pPr>
+                <w:pStyle w:val="Bibliography"/>
+                <w:ind w:left="720" w:hanging="720"/>
+                <w:rPr>
+                  <w:noProof/>
+                  <w:lang w:val="es-MX"/>
+                </w:rPr>
+              </w:pPr>
+              <w:r>
+                <w:rPr>
+                  <w:noProof/>
+                  <w:lang w:val="es-MX"/>
+                </w:rPr>
+                <w:t xml:space="preserve">SERENDIPIA. (26 de ABRIL de 2022). </w:t>
+              </w:r>
+              <w:r>
+                <w:rPr>
+                  <w:i/>
+                  <w:iCs/>
+                  <w:noProof/>
+                  <w:lang w:val="es-MX"/>
+                </w:rPr>
+                <w:t>ESCASEZ DE AGUA en México afecta ¡al 40% del país!</w:t>
+              </w:r>
+              <w:r>
+                <w:rPr>
+                  <w:noProof/>
+                  <w:lang w:val="es-MX"/>
+                </w:rPr>
+                <w:t xml:space="preserve"> Obtenido de youtube: https://www.youtube.com/watch?v=RKuYkYnCdw4&amp;t=150s</w:t>
+              </w:r>
+            </w:p>
+            <w:p>
+              <w:pPr>
+                <w:pStyle w:val="Bibliography"/>
+                <w:ind w:left="720" w:hanging="720"/>
+                <w:rPr>
+                  <w:noProof/>
+                  <w:lang w:val="es-MX"/>
+                </w:rPr>
+              </w:pPr>
+              <w:r>
+                <w:rPr>
+                  <w:noProof/>
+                  <w:lang w:val="es-MX"/>
+                </w:rPr>
+                <w:t xml:space="preserve">silvertubos. (15 de AGOSTO de 2024). </w:t>
+              </w:r>
+              <w:r>
+                <w:rPr>
+                  <w:i/>
+                  <w:iCs/>
+                  <w:noProof/>
+                  <w:lang w:val="es-MX"/>
+                </w:rPr>
                 <w:t>silvertubos.COM</w:t>
               </w:r>
               <w:r>
@@ -186,6 +386,73 @@
                   <w:lang w:val="es-MX"/>
                 </w:rPr>
                 <w:t>. Obtenido de 10 Recomendaciones para ahorrar agua en nuestra empresa o industria!: https://silvertubos.com/ahorrando-agua-en-nuestra-empresa-o-industria/#:~:text=Optar%20por%20aguas%20no%20potables,Utilizar%20sistemas%20de%20riego%20autom%C3%A1tico.</w:t>
+              </w:r>
+            </w:p>
+            <w:p>
+              <w:pPr>
+                <w:pStyle w:val="Bibliography"/>
+                <w:ind w:left="720" w:hanging="720"/>
+                <w:rPr>
+                  <w:noProof/>
+                  <w:lang w:val="es-MX"/>
+                </w:rPr>
+              </w:pPr>
+              <w:r>
+                <w:rPr>
+                  <w:noProof/>
+                  <w:lang w:val="es-MX"/>
+                </w:rPr>
+                <w:lastRenderedPageBreak/>
+                <w:t xml:space="preserve">Thermal Engineering. (s.f.). </w:t>
+              </w:r>
+              <w:r>
+                <w:rPr>
+                  <w:i/>
+                  <w:iCs/>
+                  <w:noProof/>
+                  <w:lang w:val="es-MX"/>
+                </w:rPr>
+                <w:t>Detección de fugas mediante termografía infrarroja</w:t>
+              </w:r>
+              <w:r>
+                <w:rPr>
+                  <w:noProof/>
+                  <w:lang w:val="es-MX"/>
+                </w:rPr>
+                <w:t>. Obtenido de https://www.thermal-engineering.org/: https://www.thermal-engineering.org/es/deteccion-de-fugas-mediante-termografia-infrarroja/</w:t>
+              </w:r>
+            </w:p>
+            <w:p>
+              <w:pPr>
+                <w:pStyle w:val="Bibliography"/>
+                <w:ind w:left="720" w:hanging="720"/>
+                <w:rPr>
+                  <w:noProof/>
+                  <w:lang w:val="es-MX"/>
+                </w:rPr>
+              </w:pPr>
+              <w:r>
+                <w:rPr>
+                  <w:noProof/>
+                  <w:lang w:val="es-MX"/>
+                </w:rPr>
+                <w:t xml:space="preserve">Tonatiuh Moreno, C. (14 de ABRIL de 2024). </w:t>
+              </w:r>
+              <w:r>
+                <w:rPr>
+                  <w:i/>
+                  <w:iCs/>
+                  <w:noProof/>
+                  <w:lang w:val="es-MX"/>
+                </w:rPr>
+                <w:t xml:space="preserve">¿Cómo superar la Crisis Mundial del Agua? </w:t>
+              </w:r>
+              <w:r>
+                <w:rPr>
+                  <w:noProof/>
+                  <w:lang w:val="es-MX"/>
+                </w:rPr>
+                <w:t>. Obtenido de Youtube: https://www.youtube.com/watch?v=Wka0KQmCL3w&amp;t=529s</w:t>
               </w:r>
             </w:p>
             <w:p>
@@ -1057,11 +1324,160 @@
     <b:URL>https://www.youtube.com/watch?v=Zk2UFnBMnx8</b:URL>
     <b:RefOrder>4</b:RefOrder>
   </b:Source>
+  <b:Source>
+    <b:Tag>Aqu25</b:Tag>
+    <b:SourceType>InternetSite</b:SourceType>
+    <b:Guid>{EB3106F3-E24A-4EBF-A148-B7858A1B3BC5}</b:Guid>
+    <b:LCID>es-MX</b:LCID>
+    <b:Author>
+      <b:Author>
+        <b:Corporate>Aquae Fundacion</b:Corporate>
+      </b:Author>
+    </b:Author>
+    <b:Title>fundacionaquae.org</b:Title>
+    <b:InternetSiteTitle>¿Qué industrias consumen más agua?</b:InternetSiteTitle>
+    <b:Year>2025</b:Year>
+    <b:Month>ENERO</b:Month>
+    <b:Day>2020</b:Day>
+    <b:URL>https://www.fundacionaquae.org/que-industrias-consumen-mas-agua/</b:URL>
+    <b:RefOrder>5</b:RefOrder>
+  </b:Source>
+  <b:Source>
+    <b:Tag>SER22</b:Tag>
+    <b:SourceType>InternetSite</b:SourceType>
+    <b:Guid>{30ADD185-2F34-4270-B013-E5CF25014E05}</b:Guid>
+    <b:LCID>es-MX</b:LCID>
+    <b:Author>
+      <b:Author>
+        <b:Corporate>SERENDIPIA</b:Corporate>
+      </b:Author>
+    </b:Author>
+    <b:Title>ESCASEZ DE AGUA en México afecta ¡al 40% del país!</b:Title>
+    <b:InternetSiteTitle>youtube</b:InternetSiteTitle>
+    <b:Year>2022</b:Year>
+    <b:Month>ABRIL</b:Month>
+    <b:Day>26</b:Day>
+    <b:URL>https://www.youtube.com/watch?v=RKuYkYnCdw4&amp;t=150s</b:URL>
+    <b:RefOrder>6</b:RefOrder>
+  </b:Source>
+  <b:Source>
+    <b:Tag>ÓRG25</b:Tag>
+    <b:SourceType>InternetSite</b:SourceType>
+    <b:Guid>{D445C521-D157-4811-BDC1-ECC2E47262A5}</b:Guid>
+    <b:Author>
+      <b:Author>
+        <b:Corporate>ÓRGANO INFORMATIVO DE LA UNIVERSIDAD NACIONAL AUTÓNOMA DE MÉXICO</b:Corporate>
+      </b:Author>
+    </b:Author>
+    <b:Title>Más de 80% del agua se va en uso agrícola y de la industria</b:Title>
+    <b:InternetSiteTitle>www.gaceta.unam.mx</b:InternetSiteTitle>
+    <b:Year>2025</b:Year>
+    <b:Month>MARZO</b:Month>
+    <b:Day>3</b:Day>
+    <b:URL>https://www.gaceta.unam.mx/crisis-agua-industria/#:~:text=La%20industria%20contamina%20m%C3%A1s,%2C%20industrial%2C%20agr%C3%ADcola%20o%20minero.</b:URL>
+    <b:RefOrder>7</b:RefOrder>
+  </b:Source>
+  <b:Source>
+    <b:Tag>The</b:Tag>
+    <b:SourceType>InternetSite</b:SourceType>
+    <b:Guid>{54A138F2-D5D8-4553-8F49-3A46B64E7E68}</b:Guid>
+    <b:Author>
+      <b:Author>
+        <b:Corporate>Thermal Engineering</b:Corporate>
+      </b:Author>
+    </b:Author>
+    <b:Title>Detección de fugas mediante termografía infrarroja</b:Title>
+    <b:InternetSiteTitle>https://www.thermal-engineering.org/</b:InternetSiteTitle>
+    <b:URL>https://www.thermal-engineering.org/es/deteccion-de-fugas-mediante-termografia-infrarroja/</b:URL>
+    <b:RefOrder>8</b:RefOrder>
+  </b:Source>
+  <b:Source>
+    <b:Tag>Age15</b:Tag>
+    <b:SourceType>InternetSite</b:SourceType>
+    <b:Guid>{5340433E-4D4B-47EB-80E1-964B56FEF39A}</b:Guid>
+    <b:Author>
+      <b:Author>
+        <b:Corporate>Agencia de Noticias para la divulgación de la Ciencia y Tecnología</b:Corporate>
+      </b:Author>
+    </b:Author>
+    <b:Title>En México se pierde el 40 por ciento del agua potable por fugas en redes</b:Title>
+    <b:InternetSiteTitle>https://www.dicyt.com/</b:InternetSiteTitle>
+    <b:Year>2015</b:Year>
+    <b:Month>MAYO</b:Month>
+    <b:Day>18</b:Day>
+    <b:URL>https://www.dicyt.com/noticias/en-mexico-se-pierde-el-40-por-ciento-del-agua-potable-por-fugas-en-redes#:~:text=En%20M%C3%A9xico%20se%20pierde%20el,potable%20por%20fugas%20en%20redes</b:URL>
+    <b:RefOrder>9</b:RefOrder>
+  </b:Source>
+  <b:Source>
+    <b:Tag>Car22</b:Tag>
+    <b:SourceType>InternetSite</b:SourceType>
+    <b:Guid>{D06809D8-1331-4115-A4CD-3B2A9271314B}</b:Guid>
+    <b:LCID>en-GB</b:LCID>
+    <b:Author>
+      <b:Author>
+        <b:NameList>
+          <b:Person>
+            <b:Last>Carolina Rodríguez</b:Last>
+            <b:First>Bárbara</b:First>
+            <b:Middle>García, Caterin Pinto, Rafael Sánchez, Jennyfer Serrano and Eduardo Leiva</b:Middle>
+          </b:Person>
+        </b:NameList>
+      </b:Author>
+    </b:Author>
+    <b:Title>Water Context in Latin America and the Caribbean: Distribution, Regulations and Prospects for Water Reuse and Reclamation</b:Title>
+    <b:InternetSiteTitle>mdpi.com</b:InternetSiteTitle>
+    <b:Year>2022</b:Year>
+    <b:Month>NOVIEMBRE</b:Month>
+    <b:Day>7</b:Day>
+    <b:URL>https://www.mdpi.com/2073-4441/14/21/3589</b:URL>
+    <b:RefOrder>10</b:RefOrder>
+  </b:Source>
+  <b:Source>
+    <b:Tag>gru23</b:Tag>
+    <b:SourceType>InternetSite</b:SourceType>
+    <b:Guid>{BA14FB2A-9A0F-4D60-9EB1-CF3126065497}</b:Guid>
+    <b:LCID>es-MX</b:LCID>
+    <b:Author>
+      <b:Author>
+        <b:Corporate>grupohidraulica</b:Corporate>
+      </b:Author>
+    </b:Author>
+    <b:Title>¿Cuáles son las causas de una fuga de agua y cómo solucionarla?</b:Title>
+    <b:InternetSiteTitle>grupohidraulica.com</b:InternetSiteTitle>
+    <b:Year>2023</b:Year>
+    <b:Month>DICIEMBRE</b:Month>
+    <b:Day>4</b:Day>
+    <b:URL>https://grupohidraulica.com/noticias/2022/10/23/fuga-de-agua-soluciones/</b:URL>
+    <b:RefOrder>11</b:RefOrder>
+  </b:Source>
+  <b:Source>
+    <b:Tag>Ton24</b:Tag>
+    <b:SourceType>InternetSite</b:SourceType>
+    <b:Guid>{F9963344-7A03-48A8-9742-5CA3091AF584}</b:Guid>
+    <b:LCID>es-MX</b:LCID>
+    <b:Author>
+      <b:Author>
+        <b:NameList>
+          <b:Person>
+            <b:Last>Tonatiuh Moreno</b:Last>
+            <b:First>CuriosaMente</b:First>
+          </b:Person>
+        </b:NameList>
+      </b:Author>
+    </b:Author>
+    <b:Title>¿Cómo superar la Crisis Mundial del Agua? </b:Title>
+    <b:InternetSiteTitle>Youtube</b:InternetSiteTitle>
+    <b:Year>2024</b:Year>
+    <b:Month>ABRIL</b:Month>
+    <b:Day>14</b:Day>
+    <b:URL>https://www.youtube.com/watch?v=Wka0KQmCL3w&amp;t=529s</b:URL>
+    <b:RefOrder>12</b:RefOrder>
+  </b:Source>
 </b:Sources>
 </file>
 
 <file path=customXml/itemProps1.xml><?xml version="1.0" encoding="utf-8"?>
-<ds:datastoreItem xmlns:ds="http://schemas.openxmlformats.org/officeDocument/2006/customXml" ds:itemID="{F1C92E86-BB57-42E4-8CCB-C18A1B141AB0}">
+<ds:datastoreItem xmlns:ds="http://schemas.openxmlformats.org/officeDocument/2006/customXml" ds:itemID="{B0885D1B-456D-4160-B320-C5D9625C727D}">
   <ds:schemaRefs>
     <ds:schemaRef ds:uri="http://schemas.openxmlformats.org/officeDocument/2006/bibliography"/>
   </ds:schemaRefs>

</xml_diff>